<commit_message>
docs: consolida publicação, provas Android e pendências da entrega
</commit_message>
<xml_diff>
--- a/docs/evolucao/relatorio-testes.docx
+++ b/docs/evolucao/relatorio-testes.docx
@@ -30,7 +30,7 @@
           <w:b w:val="false"/>
           <w:bCs w:val="false"/>
         </w:rPr>
-        <w:t xml:space="preserve">Data: 14/10/2026. Este relatório registra evidência efetivamente produzida; testes escritos, aprovação técnica, build, sandbox e homologação de aparelho são estados distintos. As evidências históricas da Sprint 2 inicial permanecem em </w:t>
+        <w:t xml:space="preserve">Data da consolidação local: 14/10/2026; publicação e registros remotos atualizados em 15/10/2026. Este relatório registra evidência efetivamente produzida; testes escritos, aprovação técnica, build, sandbox e homologação de aparelho são estados distintos. As evidências históricas da Sprint 2 inicial permanecem em </w:t>
       </w:r>
       <w:r>
         <w:rPr>
@@ -80,7 +80,7 @@
           <w:b w:val="false"/>
           <w:bCs w:val="false"/>
         </w:rPr>
-        <w:t xml:space="preserve">Windows, Node 24.15.0, pnpm 10.33.2, PostgreSQL 17 em Docker. API Fastify, React web, SeaweedFS S3 privado e Mailpit SMTP locais. Banco de testes termina em </w:t>
+        <w:t xml:space="preserve">Windows, Node 24.15.0, pnpm 10.33.2, PostgreSQL 17 em Docker; CI reproduzida em runner Ubuntu do GitHub Actions. API Fastify, React web, SeaweedFS S3 privado e Mailpit SMTP locais. Banco de testes termina em </w:t>
       </w:r>
       <w:r>
         <w:rPr>
@@ -97,7 +97,7 @@
           <w:b w:val="false"/>
           <w:bCs w:val="false"/>
         </w:rPr>
-        <w:t xml:space="preserve">; migrations sequenciais, sem limpeza da base demonstrativa. Dados fictícios. Cliente Expo tem manifesto e lock próprios. Nenhuma cobrança/conta financeira/publicação pública foi executada durante testes.</w:t>
+        <w:t xml:space="preserve">; migrations sequenciais, sem limpeza da base demonstrativa. Dados fictícios. Cliente Expo tem manifesto e lock próprios. Não houve cobrança, abertura de conta financeira ou implantação de site/API públicos. O código foi publicado no GitHub com autorização.</w:t>
       </w:r>
     </w:p>
     <w:p>
@@ -1299,7 +1299,7 @@
                 <w:sz w:val="20"/>
                 <w:szCs w:val="20"/>
               </w:rPr>
-              <w:t xml:space="preserve">Tipos, dependências, Doctor, transporte e Hermes Android/iOS</w:t>
+              <w:t xml:space="preserve">Tipos, dependências, Doctor, transporte, Hermes Android/iOS e compilação APK</w:t>
             </w:r>
           </w:p>
         </w:tc>
@@ -1331,7 +1331,7 @@
                 <w:sz w:val="20"/>
                 <w:szCs w:val="20"/>
               </w:rPr>
-              <w:t xml:space="preserve">Passaram: verificação detalhada (evidencias/mobile-verificacao.md), 9/9 transporte (evidencias/mobile-tests.json), hashes dos bundles (evidencias/mobile-bundles.json); APK/IPA/aparelho não homologados</w:t>
+              <w:t xml:space="preserve">Passaram: verificação detalhada (evidencias/mobile-verificacao.md), 9/9 transporte (evidencias/mobile-tests.json), hashes dos bundles (evidencias/mobile-bundles.json) e build APK remoto (evidencias/github-android-build.json). Integração completa em aparelho e IPA pendentes</w:t>
             </w:r>
           </w:p>
         </w:tc>
@@ -1369,39 +1369,39 @@
                 <w:sz w:val="20"/>
                 <w:szCs w:val="20"/>
               </w:rPr>
-              <w:t xml:space="preserve">TLS local</w:t>
-            </w:r>
-          </w:p>
-        </w:tc>
-        <w:tc>
-          <w:tcPr>
-            <w:tcW w:type="dxa" w:w="3212"/>
-            <w:tcBorders>
-              <w:top w:val="single" w:color="D2DCD6" w:sz="1"/>
-              <w:left w:val="single" w:color="D2DCD6" w:sz="1"/>
-              <w:bottom w:val="single" w:color="D2DCD6" w:sz="1"/>
-              <w:right w:val="single" w:color="D2DCD6" w:sz="1"/>
-            </w:tcBorders>
-            <w:shd w:fill="FFFFFF" w:val="clear"/>
-            <w:tcMar>
-              <w:top w:type="dxa" w:w="80"/>
-              <w:left w:type="dxa" w:w="100"/>
-              <w:bottom w:type="dxa" w:w="80"/>
-              <w:right w:type="dxa" w:w="100"/>
-            </w:tcMar>
-          </w:tcPr>
-          <w:p>
-            <w:pPr>
-              <w:spacing w:after="40"/>
-            </w:pPr>
-            <w:r>
-              <w:rPr>
-                <w:b w:val="false"/>
-                <w:bCs w:val="false"/>
-                <w:sz w:val="20"/>
-                <w:szCs w:val="20"/>
-              </w:rPr>
-              <w:t xml:space="preserve">Container/HTTPS, banco, autenticação, origem e reinício</w:t>
+              <w:t xml:space="preserve">APK em emulador</w:t>
+            </w:r>
+          </w:p>
+        </w:tc>
+        <w:tc>
+          <w:tcPr>
+            <w:tcW w:type="dxa" w:w="3212"/>
+            <w:tcBorders>
+              <w:top w:val="single" w:color="D2DCD6" w:sz="1"/>
+              <w:left w:val="single" w:color="D2DCD6" w:sz="1"/>
+              <w:bottom w:val="single" w:color="D2DCD6" w:sz="1"/>
+              <w:right w:val="single" w:color="D2DCD6" w:sz="1"/>
+            </w:tcBorders>
+            <w:shd w:fill="FFFFFF" w:val="clear"/>
+            <w:tcMar>
+              <w:top w:type="dxa" w:w="80"/>
+              <w:left w:type="dxa" w:w="100"/>
+              <w:bottom w:type="dxa" w:w="80"/>
+              <w:right w:type="dxa" w:w="100"/>
+            </w:tcMar>
+          </w:tcPr>
+          <w:p>
+            <w:pPr>
+              <w:spacing w:after="40"/>
+            </w:pPr>
+            <w:r>
+              <w:rPr>
+                <w:b w:val="false"/>
+                <w:bCs w:val="false"/>
+                <w:sz w:val="20"/>
+                <w:szCs w:val="20"/>
+              </w:rPr>
+              <w:t xml:space="preserve">Instalação e abertura da tela de login no Android API 35 x86_64</w:t>
             </w:r>
           </w:p>
         </w:tc>
@@ -1433,7 +1433,7 @@
                 <w:sz w:val="20"/>
                 <w:szCs w:val="20"/>
               </w:rPr>
-              <w:t xml:space="preserve">TLS 1.3 (evidencias/production-tls.json): CA explícita, cookie Secure/HttpOnly, HTTP 200/201, mutation sem Origin 403 e sessão/perfil preservados após reinício da aplicação; sem trust global/domínio público</w:t>
+              <w:t xml:space="preserve">Passou (evidencias/android-emulator-result.json), captura real (evidencias/android-emulator-startup.png) e run remoto (https://github.com/DaviSouza78/LinkAtletas/actions/runs/38675093814). Sem crash detectado; fluxo com backend e aparelho físico não executados</w:t>
             </w:r>
           </w:p>
         </w:tc>
@@ -1471,39 +1471,39 @@
                 <w:sz w:val="20"/>
                 <w:szCs w:val="20"/>
               </w:rPr>
-              <w:t xml:space="preserve">Backup/restauração</w:t>
-            </w:r>
-          </w:p>
-        </w:tc>
-        <w:tc>
-          <w:tcPr>
-            <w:tcW w:type="dxa" w:w="3212"/>
-            <w:tcBorders>
-              <w:top w:val="single" w:color="D2DCD6" w:sz="1"/>
-              <w:left w:val="single" w:color="D2DCD6" w:sz="1"/>
-              <w:bottom w:val="single" w:color="D2DCD6" w:sz="1"/>
-              <w:right w:val="single" w:color="D2DCD6" w:sz="1"/>
-            </w:tcBorders>
-            <w:shd w:fill="FFFFFF" w:val="clear"/>
-            <w:tcMar>
-              <w:top w:type="dxa" w:w="80"/>
-              <w:left w:type="dxa" w:w="100"/>
-              <w:bottom w:type="dxa" w:w="80"/>
-              <w:right w:type="dxa" w:w="100"/>
-            </w:tcMar>
-          </w:tcPr>
-          <w:p>
-            <w:pPr>
-              <w:spacing w:after="40"/>
-            </w:pPr>
-            <w:r>
-              <w:rPr>
-                <w:b w:val="false"/>
-                <w:bCs w:val="false"/>
-                <w:sz w:val="20"/>
-                <w:szCs w:val="20"/>
-              </w:rPr>
-              <w:t xml:space="preserve">Banco e S3 cifrados em destinos isolados</w:t>
+              <w:t xml:space="preserve">TLS local</w:t>
+            </w:r>
+          </w:p>
+        </w:tc>
+        <w:tc>
+          <w:tcPr>
+            <w:tcW w:type="dxa" w:w="3212"/>
+            <w:tcBorders>
+              <w:top w:val="single" w:color="D2DCD6" w:sz="1"/>
+              <w:left w:val="single" w:color="D2DCD6" w:sz="1"/>
+              <w:bottom w:val="single" w:color="D2DCD6" w:sz="1"/>
+              <w:right w:val="single" w:color="D2DCD6" w:sz="1"/>
+            </w:tcBorders>
+            <w:shd w:fill="FFFFFF" w:val="clear"/>
+            <w:tcMar>
+              <w:top w:type="dxa" w:w="80"/>
+              <w:left w:type="dxa" w:w="100"/>
+              <w:bottom w:type="dxa" w:w="80"/>
+              <w:right w:type="dxa" w:w="100"/>
+            </w:tcMar>
+          </w:tcPr>
+          <w:p>
+            <w:pPr>
+              <w:spacing w:after="40"/>
+            </w:pPr>
+            <w:r>
+              <w:rPr>
+                <w:b w:val="false"/>
+                <w:bCs w:val="false"/>
+                <w:sz w:val="20"/>
+                <w:szCs w:val="20"/>
+              </w:rPr>
+              <w:t xml:space="preserve">Container/HTTPS, banco, autenticação, origem e reinício</w:t>
             </w:r>
           </w:p>
         </w:tc>
@@ -1535,7 +1535,7 @@
                 <w:sz w:val="20"/>
                 <w:szCs w:val="20"/>
               </w:rPr>
-              <w:t xml:space="preserve">36 tabelas e checksums iguais (evidencias/backup-restore.json), roundtrip de campo/mídia e dump sem texto claro; worker privado (evidencias/private-network-backup.json)</w:t>
+              <w:t xml:space="preserve">TLS 1.3 (evidencias/production-tls.json): CA explícita, cookie Secure/HttpOnly, HTTP 200/201, mutation sem Origin 403 e sessão/perfil preservados após reinício da aplicação; sem trust global/domínio público</w:t>
             </w:r>
           </w:p>
         </w:tc>
@@ -1573,39 +1573,39 @@
                 <w:sz w:val="20"/>
                 <w:szCs w:val="20"/>
               </w:rPr>
-              <w:t xml:space="preserve">Carga do match</w:t>
-            </w:r>
-          </w:p>
-        </w:tc>
-        <w:tc>
-          <w:tcPr>
-            <w:tcW w:type="dxa" w:w="3212"/>
-            <w:tcBorders>
-              <w:top w:val="single" w:color="D2DCD6" w:sz="1"/>
-              <w:left w:val="single" w:color="D2DCD6" w:sz="1"/>
-              <w:bottom w:val="single" w:color="D2DCD6" w:sz="1"/>
-              <w:right w:val="single" w:color="D2DCD6" w:sz="1"/>
-            </w:tcBorders>
-            <w:shd w:fill="FFFFFF" w:val="clear"/>
-            <w:tcMar>
-              <w:top w:type="dxa" w:w="80"/>
-              <w:left w:type="dxa" w:w="100"/>
-              <w:bottom w:type="dxa" w:w="80"/>
-              <w:right w:type="dxa" w:w="100"/>
-            </w:tcMar>
-          </w:tcPr>
-          <w:p>
-            <w:pPr>
-              <w:spacing w:after="40"/>
-            </w:pPr>
-            <w:r>
-              <w:rPr>
-                <w:b w:val="false"/>
-                <w:bCs w:val="false"/>
-                <w:sz w:val="20"/>
-                <w:szCs w:val="20"/>
-              </w:rPr>
-              <w:t xml:space="preserve">500 treinadores sintéticos, 200 chamadas HTTP, concorrência 10</w:t>
+              <w:t xml:space="preserve">Backup/restauração</w:t>
+            </w:r>
+          </w:p>
+        </w:tc>
+        <w:tc>
+          <w:tcPr>
+            <w:tcW w:type="dxa" w:w="3212"/>
+            <w:tcBorders>
+              <w:top w:val="single" w:color="D2DCD6" w:sz="1"/>
+              <w:left w:val="single" w:color="D2DCD6" w:sz="1"/>
+              <w:bottom w:val="single" w:color="D2DCD6" w:sz="1"/>
+              <w:right w:val="single" w:color="D2DCD6" w:sz="1"/>
+            </w:tcBorders>
+            <w:shd w:fill="FFFFFF" w:val="clear"/>
+            <w:tcMar>
+              <w:top w:type="dxa" w:w="80"/>
+              <w:left w:type="dxa" w:w="100"/>
+              <w:bottom w:type="dxa" w:w="80"/>
+              <w:right w:type="dxa" w:w="100"/>
+            </w:tcMar>
+          </w:tcPr>
+          <w:p>
+            <w:pPr>
+              <w:spacing w:after="40"/>
+            </w:pPr>
+            <w:r>
+              <w:rPr>
+                <w:b w:val="false"/>
+                <w:bCs w:val="false"/>
+                <w:sz w:val="20"/>
+                <w:szCs w:val="20"/>
+              </w:rPr>
+              <w:t xml:space="preserve">Banco e S3 cifrados em destinos isolados</w:t>
             </w:r>
           </w:p>
         </w:tc>
@@ -1637,7 +1637,7 @@
                 <w:sz w:val="20"/>
                 <w:szCs w:val="20"/>
               </w:rPr>
-              <w:t xml:space="preserve">Medição (evidencias/carga-matchmaking.json): 200 respostas 200, p50 78,54 ms, p95 97,78 ms, p99 132,54 ms; não extrapolar nuvem/escala</w:t>
+              <w:t xml:space="preserve">36 tabelas e checksums iguais (evidencias/backup-restore.json), roundtrip de campo/mídia e dump sem texto claro; worker privado (evidencias/private-network-backup.json)</w:t>
             </w:r>
           </w:p>
         </w:tc>
@@ -1675,39 +1675,39 @@
                 <w:sz w:val="20"/>
                 <w:szCs w:val="20"/>
               </w:rPr>
-              <w:t xml:space="preserve">CI e build final</w:t>
-            </w:r>
-          </w:p>
-        </w:tc>
-        <w:tc>
-          <w:tcPr>
-            <w:tcW w:type="dxa" w:w="3212"/>
-            <w:tcBorders>
-              <w:top w:val="single" w:color="D2DCD6" w:sz="1"/>
-              <w:left w:val="single" w:color="D2DCD6" w:sz="1"/>
-              <w:bottom w:val="single" w:color="D2DCD6" w:sz="1"/>
-              <w:right w:val="single" w:color="D2DCD6" w:sz="1"/>
-            </w:tcBorders>
-            <w:shd w:fill="FFFFFF" w:val="clear"/>
-            <w:tcMar>
-              <w:top w:type="dxa" w:w="80"/>
-              <w:left w:type="dxa" w:w="100"/>
-              <w:bottom w:type="dxa" w:w="80"/>
-              <w:right w:type="dxa" w:w="100"/>
-            </w:tcMar>
-          </w:tcPr>
-          <w:p>
-            <w:pPr>
-              <w:spacing w:after="40"/>
-            </w:pPr>
-            <w:r>
-              <w:rPr>
-                <w:b w:val="false"/>
-                <w:bCs w:val="false"/>
-                <w:sz w:val="20"/>
-                <w:szCs w:val="20"/>
-              </w:rPr>
-              <w:t xml:space="preserve">Workflow e scripts versionados</w:t>
+              <w:t xml:space="preserve">Carga do match</w:t>
+            </w:r>
+          </w:p>
+        </w:tc>
+        <w:tc>
+          <w:tcPr>
+            <w:tcW w:type="dxa" w:w="3212"/>
+            <w:tcBorders>
+              <w:top w:val="single" w:color="D2DCD6" w:sz="1"/>
+              <w:left w:val="single" w:color="D2DCD6" w:sz="1"/>
+              <w:bottom w:val="single" w:color="D2DCD6" w:sz="1"/>
+              <w:right w:val="single" w:color="D2DCD6" w:sz="1"/>
+            </w:tcBorders>
+            <w:shd w:fill="FFFFFF" w:val="clear"/>
+            <w:tcMar>
+              <w:top w:type="dxa" w:w="80"/>
+              <w:left w:type="dxa" w:w="100"/>
+              <w:bottom w:type="dxa" w:w="80"/>
+              <w:right w:type="dxa" w:w="100"/>
+            </w:tcMar>
+          </w:tcPr>
+          <w:p>
+            <w:pPr>
+              <w:spacing w:after="40"/>
+            </w:pPr>
+            <w:r>
+              <w:rPr>
+                <w:b w:val="false"/>
+                <w:bCs w:val="false"/>
+                <w:sz w:val="20"/>
+                <w:szCs w:val="20"/>
+              </w:rPr>
+              <w:t xml:space="preserve">500 treinadores sintéticos, 200 chamadas HTTP, concorrência 10</w:t>
             </w:r>
           </w:p>
         </w:tc>
@@ -1739,7 +1739,7 @@
                 <w:sz w:val="20"/>
                 <w:szCs w:val="20"/>
               </w:rPr>
-              <w:t xml:space="preserve">Tipos/build aprovados (evidencias/verificacao-build.txt); CI (../../.github/workflows/ci.yml) preparada, execução remota não realizada</w:t>
+              <w:t xml:space="preserve">Medição (evidencias/carga-matchmaking.json): 200 respostas 200, p50 78,54 ms, p95 97,78 ms, p99 132,54 ms; não extrapolar nuvem/escala</w:t>
             </w:r>
           </w:p>
         </w:tc>
@@ -1777,6 +1777,108 @@
                 <w:sz w:val="20"/>
                 <w:szCs w:val="20"/>
               </w:rPr>
+              <w:t xml:space="preserve">CI e build final</w:t>
+            </w:r>
+          </w:p>
+        </w:tc>
+        <w:tc>
+          <w:tcPr>
+            <w:tcW w:type="dxa" w:w="3212"/>
+            <w:tcBorders>
+              <w:top w:val="single" w:color="D2DCD6" w:sz="1"/>
+              <w:left w:val="single" w:color="D2DCD6" w:sz="1"/>
+              <w:bottom w:val="single" w:color="D2DCD6" w:sz="1"/>
+              <w:right w:val="single" w:color="D2DCD6" w:sz="1"/>
+            </w:tcBorders>
+            <w:shd w:fill="FFFFFF" w:val="clear"/>
+            <w:tcMar>
+              <w:top w:type="dxa" w:w="80"/>
+              <w:left w:type="dxa" w:w="100"/>
+              <w:bottom w:type="dxa" w:w="80"/>
+              <w:right w:type="dxa" w:w="100"/>
+            </w:tcMar>
+          </w:tcPr>
+          <w:p>
+            <w:pPr>
+              <w:spacing w:after="40"/>
+            </w:pPr>
+            <w:r>
+              <w:rPr>
+                <w:b w:val="false"/>
+                <w:bCs w:val="false"/>
+                <w:sz w:val="20"/>
+                <w:szCs w:val="20"/>
+              </w:rPr>
+              <w:t xml:space="preserve">Instalação, tipos/build, Vitest, backup, browsers/axe, Expo e TLS/reinício</w:t>
+            </w:r>
+          </w:p>
+        </w:tc>
+        <w:tc>
+          <w:tcPr>
+            <w:tcW w:type="dxa" w:w="3214"/>
+            <w:tcBorders>
+              <w:top w:val="single" w:color="D2DCD6" w:sz="1"/>
+              <w:left w:val="single" w:color="D2DCD6" w:sz="1"/>
+              <w:bottom w:val="single" w:color="D2DCD6" w:sz="1"/>
+              <w:right w:val="single" w:color="D2DCD6" w:sz="1"/>
+            </w:tcBorders>
+            <w:shd w:fill="FFFFFF" w:val="clear"/>
+            <w:tcMar>
+              <w:top w:type="dxa" w:w="80"/>
+              <w:left w:type="dxa" w:w="100"/>
+              <w:bottom w:type="dxa" w:w="80"/>
+              <w:right w:type="dxa" w:w="100"/>
+            </w:tcMar>
+          </w:tcPr>
+          <w:p>
+            <w:pPr>
+              <w:spacing w:after="40"/>
+            </w:pPr>
+            <w:r>
+              <w:rPr>
+                <w:b w:val="false"/>
+                <w:bCs w:val="false"/>
+                <w:sz w:val="20"/>
+                <w:szCs w:val="20"/>
+              </w:rPr>
+              <w:t xml:space="preserve">Tipos/build locais aprovados (evidencias/verificacao-build.txt); CI completa aprovada na main (https://github.com/DaviSouza78/LinkAtletas/actions/runs/38656142290), registro remoto (evidencias/github-ci-main.json)</w:t>
+            </w:r>
+          </w:p>
+        </w:tc>
+      </w:tr>
+      <w:tr>
+        <w:trPr>
+          <w:cantSplit/>
+          <w:tblHeader w:val="off"/>
+        </w:trPr>
+        <w:tc>
+          <w:tcPr>
+            <w:tcW w:type="dxa" w:w="3212"/>
+            <w:tcBorders>
+              <w:top w:val="single" w:color="D2DCD6" w:sz="1"/>
+              <w:left w:val="single" w:color="D2DCD6" w:sz="1"/>
+              <w:bottom w:val="single" w:color="D2DCD6" w:sz="1"/>
+              <w:right w:val="single" w:color="D2DCD6" w:sz="1"/>
+            </w:tcBorders>
+            <w:shd w:fill="FFFFFF" w:val="clear"/>
+            <w:tcMar>
+              <w:top w:type="dxa" w:w="80"/>
+              <w:left w:type="dxa" w:w="100"/>
+              <w:bottom w:type="dxa" w:w="80"/>
+              <w:right w:type="dxa" w:w="100"/>
+            </w:tcMar>
+          </w:tcPr>
+          <w:p>
+            <w:pPr>
+              <w:spacing w:after="40"/>
+            </w:pPr>
+            <w:r>
+              <w:rPr>
+                <w:b w:val="false"/>
+                <w:bCs w:val="false"/>
+                <w:sz w:val="20"/>
+                <w:szCs w:val="20"/>
+              </w:rPr>
               <w:t xml:space="preserve">Documentação</w:t>
             </w:r>
           </w:p>
@@ -1863,6 +1965,53 @@
           <w:bCs w:val="false"/>
         </w:rPr>
         <w:t xml:space="preserve">Contagens acima foram conferidas em arquivos de resultado, não inferidas apenas da existência de cenários. Falhas de tentativas anteriores não substituem o resultado final; correções e limites permanecem explícitos. O manifesto de backup registra necessidade de pausar escritas em operação, pois não existe transação distribuída banco/objetos.</w:t>
+      </w:r>
+    </w:p>
+    <w:p>
+      <w:pPr>
+        <w:spacing w:after="50"/>
+      </w:pPr>
+    </w:p>
+    <w:p>
+      <w:pPr>
+        <w:widowControl/>
+        <w:spacing w:after="100" w:line="260"/>
+      </w:pPr>
+      <w:r>
+        <w:rPr>
+          <w:b w:val="false"/>
+          <w:bCs w:val="false"/>
+        </w:rPr>
+        <w:t xml:space="preserve">Na finalização de 15/10, o cenário de chat passou a forçar o fechamento atrasado da conexão descartada pelo StrictMode depois de aberta a conexão válida. O indicador permaneceu conectado e a troca real de mensagens foi verificada nos três motores. A </w:t>
+      </w:r>
+      <w:hyperlink w:history="1" r:id="rIdqvdkivuz4wckcstxshb5x">
+        <w:r>
+          <w:rPr>
+            <w:rStyle w:val="Hyperlink"/>
+          </w:rPr>
+          <w:t xml:space="preserve">CI após a correção</w:t>
+        </w:r>
+      </w:hyperlink>
+      <w:r>
+        <w:rPr>
+          <w:b w:val="false"/>
+          <w:bCs w:val="false"/>
+        </w:rPr>
+        <w:t xml:space="preserve"> aprovou novamente todas as etapas; </w:t>
+      </w:r>
+      <w:r>
+        <w:rPr>
+          <w:b w:val="false"/>
+          <w:bCs w:val="false"/>
+        </w:rPr>
+        <w:t xml:space="preserve">registro remoto (evidencias/github-ci-finalizacao.json)</w:t>
+      </w:r>
+      <w:r>
+        <w:rPr>
+          <w:b w:val="false"/>
+          <w:bCs w:val="false"/>
+        </w:rPr>
+        <w:t xml:space="preserve">.</w:t>
       </w:r>
     </w:p>
     <w:p>
@@ -2133,7 +2282,35 @@
           <w:b w:val="false"/>
           <w:bCs w:val="false"/>
         </w:rPr>
-        <w:t xml:space="preserve">Asaas sandbox real, split/repasse de carteira real, CREF autorizado, SMTP externo, S3 hospedado, domínio público, stores e instalação/dispositivo Android/iOS. Google OAuth/Agenda/Meet reais também não foram exercitados. Axe não substitui ensaio com leitor de tela ou revisão integral WCAG. WebKit não comprova Safari real; Chromium não comprova Edge real. Carga local não comprova autoescala em nuvem.</w:t>
+        <w:t xml:space="preserve">Asaas sandbox real, split/repasse de carteira real, CREF autorizado, SMTP externo, S3 hospedado, domínio público, stores e fluxo completo em aparelhos Android/iOS. Google OAuth/Agenda/Meet reais também não foram exercitados. Axe não substitui ensaio com leitor de tela ou revisão integral WCAG. WebKit não comprova Safari real; Chromium não comprova Edge real. Carga local não comprova autoescala em nuvem. Veja </w:t>
+      </w:r>
+      <w:r>
+        <w:rPr>
+          <w:b w:val="false"/>
+          <w:bCs w:val="false"/>
+        </w:rPr>
+        <w:t xml:space="preserve">publicação e APK (publicacao.md)</w:t>
+      </w:r>
+      <w:r>
+        <w:rPr>
+          <w:b w:val="false"/>
+          <w:bCs w:val="false"/>
+        </w:rPr>
+        <w:t xml:space="preserve"> e </w:t>
+      </w:r>
+      <w:r>
+        <w:rPr>
+          <w:b w:val="false"/>
+          <w:bCs w:val="false"/>
+        </w:rPr>
+        <w:t xml:space="preserve">pendências humanas (pendencias-lucca.md)</w:t>
+      </w:r>
+      <w:r>
+        <w:rPr>
+          <w:b w:val="false"/>
+          <w:bCs w:val="false"/>
+        </w:rPr>
+        <w:t xml:space="preserve">.</w:t>
       </w:r>
     </w:p>
     <w:p>

</xml_diff>